<commit_message>
docs(final): set title-page institution — AI Center of Excellence, Shiv Nadar IoE
Author/supervisor spellings confirmed; replace the [TODO] institution placeholder
with the AI Center of Excellence, Shiv Nadar Institution of Eminence. Regenerate
APT_final_report.docx.

Co-Authored-By: Claude Opus 4.8 <noreply@anthropic.com>
</commit_message>
<xml_diff>
--- a/APT_final_report.docx
+++ b/APT_final_report.docx
@@ -96,15 +96,15 @@
           <w:color w:val="555555"/>
           <w:sz w:val="22"/>
         </w:rPr>
-        <w:t xml:space="preserve">Institution / Department:  </w:t>
+        <w:t xml:space="preserve">Institution:  </w:t>
       </w:r>
       <w:r>
         <w:rPr>
-          <w:b w:val="0"/>
+          <w:b/>
           <w:color w:val="1F3255"/>
           <w:sz w:val="23"/>
         </w:rPr>
-        <w:t>[TODO — fill before submission]</w:t>
+        <w:t>AI Center of Excellence · Shiv Nadar Institution of Eminence</w:t>
       </w:r>
     </w:p>
     <w:p>
@@ -18964,7 +18964,7 @@
           <w:color w:val="555555"/>
           <w:sz w:val="17"/>
         </w:rPr>
-        <w:t>experiment/risk-managed-2b  feature/cost-beta-notional  feature/crypto-adaptive  feature/final-report  feature/kalman-equilibrium  feature/ou-optimal-thresholds  feature/phase4-omnibus  feature/reporting-standard  main  phase/3-intraday  origin/experiment/risk-managed-2b  origin/feature/cost-beta-notional  origin/feature/crypto-adaptive  origin/feature/kalman-equilibrium  origin/feature/ou-optimal-thresholds  origin/feature/phase4-omnibus  origin/feature/reporting-standard  origin/main  origin/phase/3-intraday  origin/phase1/minute-ingestions</w:t>
+        <w:t>experiment/risk-managed-2b  feature/cost-beta-notional  feature/crypto-adaptive  feature/final-report  feature/kalman-equilibrium  feature/ou-optimal-thresholds  feature/phase4-omnibus  feature/reporting-standard  main  phase/3-intraday  origin/experiment/risk-managed-2b  origin/feature/cost-beta-notional  origin/feature/crypto-adaptive  origin/feature/final-report  origin/feature/kalman-equilibrium  origin/feature/ou-optimal-thresholds  origin/feature/phase4-omnibus  origin/feature/reporting-standard  origin/main  origin/phase/3-intraday  origin/phase1/minute-ingestions</w:t>
       </w:r>
     </w:p>
     <w:p>
@@ -18978,6 +18978,19 @@
           <w:sz w:val="19"/>
         </w:rPr>
         <w:t>Commit provenance (most recent 40 across all branches):</w:t>
+      </w:r>
+    </w:p>
+    <w:p>
+      <w:pPr>
+        <w:spacing w:after="0"/>
+      </w:pPr>
+      <w:r>
+        <w:rPr>
+          <w:rFonts w:ascii="Consolas" w:hAnsi="Consolas"/>
+          <w:color w:val="555555"/>
+          <w:sz w:val="15"/>
+        </w:rPr>
+        <w:t>1288420 docs(final): assemble APT_final_report.docx — capstone methodology + OOS validation</w:t>
       </w:r>
     </w:p>
     <w:p>
@@ -19485,19 +19498,6 @@
           <w:sz w:val="15"/>
         </w:rPr>
         <w:t>6b91f8b phase 2b vol-matched final curve</w:t>
-      </w:r>
-    </w:p>
-    <w:p>
-      <w:pPr>
-        <w:spacing w:after="0"/>
-      </w:pPr>
-      <w:r>
-        <w:rPr>
-          <w:rFonts w:ascii="Consolas" w:hAnsi="Consolas"/>
-          <w:color w:val="555555"/>
-          <w:sz w:val="15"/>
-        </w:rPr>
-        <w:t>1a42e86 phase 2b: risk-managed walk-forward (sizing/risk ablation ladder)</w:t>
       </w:r>
     </w:p>
     <w:p>

</xml_diff>